<commit_message>
Volume 1, Chapter 8: each language uses its own tables and folders; every setup step tested
</commit_message>
<xml_diff>
--- a/Volume 1/Chapter 08 - Web Applications/SPA_Vol1_Ch8_Lesson8_0_Web_Setup.docx
+++ b/Volume 1/Chapter 08 - Web Applications/SPA_Vol1_Ch8_Lesson8_0_Web_Setup.docx
@@ -1135,9 +1135,252 @@
     </w:p>
     <w:p>
       <w:pPr>
+        <w:keepNext/>
+      </w:pPr>
+      <w:r>
+        <w:t>Next, let the tools create the C# and Go projects, as in Lesson 6.0. Remember, dotnet new web makes an empty ASP.NET Core web project in the folder -o names: its .csproj names Microsoft.NET.Sdk.Web, which brings in ASP.NET Core and Razor, and --exclude-launch-settings leaves out the file that would change how dotnet run starts the program. Each starter Program.cs is replaced with this lesson's code in the C# section. Remember, go mod init makes the .\go folder a module by writing .\go\go.mod; its go line sh</w:t>
+      </w:r>
+      <w:r>
+        <w:t>ows your own Go version.</w:t>
+      </w:r>
+    </w:p>
+    <w:p>
+      <w:pPr>
+        <w:keepNext/>
+      </w:pPr>
+    </w:p>
+    <w:p>
+      <w:pPr>
+        <w:pStyle w:val="CommandBlock"/>
+        <w:keepNext/>
+      </w:pPr>
+      <w:r>
+        <w:t>dotnet new web -o .\csharp\BasicTemplateCheck --exclude-launch-settings</w:t>
+      </w:r>
+    </w:p>
+    <w:p>
+      <w:pPr>
+        <w:pStyle w:val="CommandBlock"/>
+        <w:keepNext/>
+      </w:pPr>
+      <w:r>
+        <w:t>dotnet new web -o .\csharp\TemplateCheck --exclude-launch-settings</w:t>
+      </w:r>
+    </w:p>
+    <w:p>
+      <w:pPr>
+        <w:pStyle w:val="CommandBlock"/>
+      </w:pPr>
+      <w:r>
+        <w:t>go -C .\go mod init example.com/websetup</w:t>
+      </w:r>
+    </w:p>
+    <w:p>
+      <w:pPr>
+        <w:keepNext/>
+      </w:pPr>
+    </w:p>
+    <w:p>
+      <w:r>
+        <w:t>As in Lesson 6.0, type each .csproj over the one dotnet new web made, for OutputType Exe and RunWorkingDirectory, which starts the program in the folder dotnet run is typed in: notepad .\csharp\BasicTemplateCheck\BasicTemplateCheck.csproj opens the file; press Ctrl+A, type the file below in place of its lines, save it with Ctrl+S, and close Notepad. Do the same for .\csharp\TemplateCheck\TemplateCheck.csproj.</w:t>
+      </w:r>
+    </w:p>
+    <w:p>
+      <w:pPr>
+        <w:keepNext/>
+      </w:pPr>
+    </w:p>
+    <w:p>
+      <w:pPr>
         <w:pStyle w:val="Heading3"/>
       </w:pPr>
       <w:r>
+        <w:t>csharp/BasicTemplateCheck/BasicTemplateCheck.csproj</w:t>
+      </w:r>
+    </w:p>
+    <w:p>
+      <w:pPr>
+        <w:pStyle w:val="SourceCode"/>
+        <w:keepNext/>
+      </w:pPr>
+      <w:r>
+        <w:t>&lt;Project Sdk="Microsoft.NET.Sdk.Web"&gt;</w:t>
+      </w:r>
+    </w:p>
+    <w:p>
+      <w:pPr>
+        <w:pStyle w:val="SourceCode"/>
+        <w:keepNext/>
+      </w:pPr>
+      <w:r>
+        <w:t xml:space="preserve">  &lt;PropertyGroup&gt;</w:t>
+      </w:r>
+    </w:p>
+    <w:p>
+      <w:pPr>
+        <w:pStyle w:val="SourceCode"/>
+        <w:keepNext/>
+      </w:pPr>
+      <w:r>
+        <w:t xml:space="preserve">    &lt;OutputType&gt;Exe&lt;/OutputType&gt;</w:t>
+      </w:r>
+    </w:p>
+    <w:p>
+      <w:pPr>
+        <w:pStyle w:val="SourceCode"/>
+        <w:keepNext/>
+      </w:pPr>
+      <w:r>
+        <w:t xml:space="preserve">    &lt;TargetFramework&gt;net10.0&lt;/TargetFramework&gt;</w:t>
+      </w:r>
+    </w:p>
+    <w:p>
+      <w:pPr>
+        <w:pStyle w:val="SourceCode"/>
+        <w:keepNext/>
+      </w:pPr>
+      <w:r>
+        <w:t xml:space="preserve">    &lt;ImplicitUsings&gt;enable&lt;/ImplicitUsings&gt;</w:t>
+      </w:r>
+    </w:p>
+    <w:p>
+      <w:pPr>
+        <w:pStyle w:val="SourceCode"/>
+        <w:keepNext/>
+      </w:pPr>
+      <w:r>
+        <w:t xml:space="preserve">    &lt;Nullable&gt;enable&lt;/Nullable&gt;</w:t>
+      </w:r>
+    </w:p>
+    <w:p>
+      <w:pPr>
+        <w:pStyle w:val="SourceCode"/>
+        <w:keepNext/>
+      </w:pPr>
+      <w:r>
+        <w:t xml:space="preserve">    &lt;RunWorkingDirectory&gt;$(MSBuildStartupDirectory)&lt;/RunWorkingDirectory&gt;</w:t>
+      </w:r>
+    </w:p>
+    <w:p>
+      <w:pPr>
+        <w:pStyle w:val="SourceCode"/>
+        <w:keepNext/>
+      </w:pPr>
+      <w:r>
+        <w:t xml:space="preserve">  &lt;/PropertyGroup&gt;</w:t>
+      </w:r>
+    </w:p>
+    <w:p>
+      <w:pPr>
+        <w:pStyle w:val="SourceCode"/>
+      </w:pPr>
+      <w:r>
+        <w:t>&lt;/Project&gt;</w:t>
+      </w:r>
+    </w:p>
+    <w:p>
+      <w:pPr>
+        <w:keepNext/>
+      </w:pPr>
+    </w:p>
+    <w:p>
+      <w:pPr>
+        <w:pStyle w:val="Heading3"/>
+      </w:pPr>
+      <w:r>
+        <w:t>csharp/TemplateCheck/TemplateCheck.csproj</w:t>
+      </w:r>
+    </w:p>
+    <w:p>
+      <w:pPr>
+        <w:pStyle w:val="SourceCode"/>
+        <w:keepNext/>
+      </w:pPr>
+      <w:r>
+        <w:t>&lt;Project Sdk="Microsoft.NET.Sdk.Web"&gt;</w:t>
+      </w:r>
+    </w:p>
+    <w:p>
+      <w:pPr>
+        <w:pStyle w:val="SourceCode"/>
+        <w:keepNext/>
+      </w:pPr>
+      <w:r>
+        <w:t xml:space="preserve">  &lt;PropertyGroup&gt;</w:t>
+      </w:r>
+    </w:p>
+    <w:p>
+      <w:pPr>
+        <w:pStyle w:val="SourceCode"/>
+        <w:keepNext/>
+      </w:pPr>
+      <w:r>
+        <w:t xml:space="preserve">    &lt;OutputType&gt;Exe&lt;/OutputType&gt;</w:t>
+      </w:r>
+    </w:p>
+    <w:p>
+      <w:pPr>
+        <w:pStyle w:val="SourceCode"/>
+        <w:keepNext/>
+      </w:pPr>
+      <w:r>
+        <w:t xml:space="preserve">    &lt;TargetFramework&gt;net10.0&lt;/TargetFramework&gt;</w:t>
+      </w:r>
+    </w:p>
+    <w:p>
+      <w:pPr>
+        <w:pStyle w:val="SourceCode"/>
+        <w:keepNext/>
+      </w:pPr>
+      <w:r>
+        <w:t xml:space="preserve">    &lt;ImplicitUsings&gt;enable&lt;/ImplicitUsings&gt;</w:t>
+      </w:r>
+    </w:p>
+    <w:p>
+      <w:pPr>
+        <w:pStyle w:val="SourceCode"/>
+        <w:keepNext/>
+      </w:pPr>
+      <w:r>
+        <w:t xml:space="preserve">    &lt;Nullable&gt;enable&lt;/Nullable&gt;</w:t>
+      </w:r>
+    </w:p>
+    <w:p>
+      <w:pPr>
+        <w:pStyle w:val="SourceCode"/>
+        <w:keepNext/>
+      </w:pPr>
+      <w:r>
+        <w:t xml:space="preserve">    &lt;RunWorkingDirectory&gt;$(MSBuildStartupDirectory)&lt;/RunWorkingDirectory&gt;</w:t>
+      </w:r>
+    </w:p>
+    <w:p>
+      <w:pPr>
+        <w:pStyle w:val="SourceCode"/>
+        <w:keepNext/>
+      </w:pPr>
+      <w:r>
+        <w:t xml:space="preserve">  &lt;/PropertyGroup&gt;</w:t>
+      </w:r>
+    </w:p>
+    <w:p>
+      <w:pPr>
+        <w:pStyle w:val="SourceCode"/>
+      </w:pPr>
+      <w:r>
+        <w:t>&lt;/Project&gt;</w:t>
+      </w:r>
+    </w:p>
+    <w:p>
+      <w:pPr>
+        <w:keepNext/>
+      </w:pPr>
+    </w:p>
+    <w:p>
+      <w:pPr>
+        <w:pStyle w:val="Heading3"/>
+      </w:pPr>
+      <w:r>
         <w:t>Linux or macOS Project Setup</w:t>
       </w:r>
     </w:p>
@@ -1204,11 +1447,55 @@
       </w:pPr>
     </w:p>
     <w:p>
-      <w:r>
-        <w:t xml:space="preserve">Save each source and supporting file from this lesson into the matching path in the project layout. As in Chapter 1, notepad .\c\basic_template_check.c creates and opens one: choose Yes, type the file, save it with Ctrl+S, and close Notepad (on Linux, nano ./c/basic_template_check.c, then Ctrl+O, Enter, and Ctrl+X). Then write .gitignore. Remember, it lists files Git must never add (Lesson 6.0): *.key for any key a later lesson copies here, and the folders the tools make and can make again, .\python\.venv, </w:t>
-      </w:r>
-      <w:r>
-        <w:t>.\typescript\node_modules, and the build outputs.</w:t>
+      <w:pPr>
+        <w:keepNext/>
+      </w:pPr>
+      <w:r>
+        <w:t>Then create the C# and Go projects with the same commands as on Windows, and type the two .csproj files exactly as shown in the Windows setup.</w:t>
+      </w:r>
+    </w:p>
+    <w:p>
+      <w:pPr>
+        <w:keepNext/>
+      </w:pPr>
+    </w:p>
+    <w:p>
+      <w:pPr>
+        <w:pStyle w:val="CommandBlock"/>
+        <w:keepNext/>
+      </w:pPr>
+      <w:r>
+        <w:t>dotnet new web -o ./csharp/BasicTemplateCheck --exclude-launch-settings</w:t>
+      </w:r>
+    </w:p>
+    <w:p>
+      <w:pPr>
+        <w:pStyle w:val="CommandBlock"/>
+        <w:keepNext/>
+      </w:pPr>
+      <w:r>
+        <w:t>dotnet new web -o ./csharp/TemplateCheck --exclude-launch-settings</w:t>
+      </w:r>
+    </w:p>
+    <w:p>
+      <w:pPr>
+        <w:pStyle w:val="CommandBlock"/>
+      </w:pPr>
+      <w:r>
+        <w:t>go -C ./go mod init example.com/websetup</w:t>
+      </w:r>
+    </w:p>
+    <w:p>
+      <w:pPr>
+        <w:keepNext/>
+      </w:pPr>
+    </w:p>
+    <w:p>
+      <w:r>
+        <w:t>You save each source file in its language's section below, as each is shown, and Step 2 makes the Python and TypeScript projects. As in Chapter 1, notepad .\c\basic_template_check.c creates and opens one: choose Yes, type the file, save it with Ctrl+S, and close Notepad (on Linux, nano ./c/basic_template_check.c, then Ctrl+O, Enter, and Ctrl+X). Then write .gitignore. Remember, it lists files Git must never add (Lesson 6.0): *.key for any key a later lesson copies here, and the folders the tools make and ca</w:t>
+      </w:r>
+      <w:r>
+        <w:t>n make again, .\python\.venv, .\typescript\node_modules, and the build outputs.</w:t>
       </w:r>
     </w:p>
     <w:p>
@@ -1312,7 +1599,20 @@
         <w:t>C, C#, and Go need nothing new: their servers' libraries came in Lesson 6.0, C writes its own templates, Razor comes with ASP.NET Core, and html/template with Go. The others are installed inside the lesson folder, each pinned to one exact version (Lesson 2.17). curl.exe downloads two C++ headers by their release addresses: inja's, and nlohmann/json's (Lesson 3.15), which inja includes as &lt;nlohmann/json.hpp&gt;, so it goes into .\cpp\nlohmann. py -m venv creates .\python\.venv, and its own Python's pip installs</w:t>
       </w:r>
       <w:r>
-        <w:t xml:space="preserve"> Flask and the six packages Flask needs, all pinned in requirements.txt: Werkzeug, Flask's HTTP layer and development server; Jinja2 and MarkupSafe, its templates and their escaping; itsdangerous, which signs data such as Flask's session cookie; click, its command line; and blinker, its signals. npm installs Express, EJS, Express's types, and the TypeScript compiler from package.json, with the smaller packages Express is built from.</w:t>
+        <w:t xml:space="preserve"> Flask and the six packages Flask needs, all pinned in requirements.txt: Werkzeug, Flask's HTTP layer and development server; Jinja2 and MarkupSafe, its templates and their escaping; itsdangerous, which signs data such as Flask's session cookie; click, its command line; and blinker, its signals. The TypeScript project needs a package.json. Remember, npm init -y, npm pkg, then npm install: the first npm install line pins Express and EJS, which the programs need when they run, with the smaller packages Expres</w:t>
+      </w:r>
+      <w:r>
+        <w:t>s is built from; the second pins the TypeScript compiler, Node's type descriptions, and Express's types, needed only to build.</w:t>
+      </w:r>
+    </w:p>
+    <w:p>
+      <w:pPr>
+        <w:keepNext/>
+      </w:pPr>
+    </w:p>
+    <w:p>
+      <w:r>
+        <w:t>First type the two settings files these installs and builds read. notepad .\python\requirements.txt creates and opens the first: choose Yes, type the file, save it with Ctrl+S, and close Notepad. Do the same for .\typescript\tsconfig.json, Chapter 7's compiler settings.</w:t>
       </w:r>
     </w:p>
     <w:p>
@@ -1325,6 +1625,234 @@
         <w:pStyle w:val="Heading3"/>
       </w:pPr>
       <w:r>
+        <w:t>python/requirements.txt</w:t>
+      </w:r>
+    </w:p>
+    <w:p>
+      <w:pPr>
+        <w:pStyle w:val="SourceCode"/>
+        <w:keepNext/>
+      </w:pPr>
+      <w:r>
+        <w:t>Flask==3.1.3</w:t>
+      </w:r>
+    </w:p>
+    <w:p>
+      <w:pPr>
+        <w:pStyle w:val="SourceCode"/>
+        <w:keepNext/>
+      </w:pPr>
+      <w:r>
+        <w:t>Werkzeug==3.1.9</w:t>
+      </w:r>
+    </w:p>
+    <w:p>
+      <w:pPr>
+        <w:pStyle w:val="SourceCode"/>
+        <w:keepNext/>
+      </w:pPr>
+      <w:r>
+        <w:t>Jinja2==3.1.6</w:t>
+      </w:r>
+    </w:p>
+    <w:p>
+      <w:pPr>
+        <w:pStyle w:val="SourceCode"/>
+        <w:keepNext/>
+      </w:pPr>
+      <w:r>
+        <w:t>MarkupSafe==3.0.4</w:t>
+      </w:r>
+    </w:p>
+    <w:p>
+      <w:pPr>
+        <w:pStyle w:val="SourceCode"/>
+        <w:keepNext/>
+      </w:pPr>
+      <w:r>
+        <w:t>itsdangerous==2.2.0</w:t>
+      </w:r>
+    </w:p>
+    <w:p>
+      <w:pPr>
+        <w:pStyle w:val="SourceCode"/>
+        <w:keepNext/>
+      </w:pPr>
+      <w:r>
+        <w:t>click==8.5.0</w:t>
+      </w:r>
+    </w:p>
+    <w:p>
+      <w:pPr>
+        <w:pStyle w:val="SourceCode"/>
+      </w:pPr>
+      <w:r>
+        <w:t>blinker==1.9.0</w:t>
+      </w:r>
+    </w:p>
+    <w:p>
+      <w:pPr>
+        <w:keepNext/>
+      </w:pPr>
+    </w:p>
+    <w:p>
+      <w:pPr>
+        <w:pStyle w:val="Heading3"/>
+      </w:pPr>
+      <w:r>
+        <w:t>typescript/tsconfig.json</w:t>
+      </w:r>
+    </w:p>
+    <w:p>
+      <w:pPr>
+        <w:pStyle w:val="SourceCode"/>
+        <w:keepNext/>
+      </w:pPr>
+      <w:r>
+        <w:t>{</w:t>
+      </w:r>
+    </w:p>
+    <w:p>
+      <w:pPr>
+        <w:pStyle w:val="SourceCode"/>
+        <w:keepNext/>
+      </w:pPr>
+      <w:r>
+        <w:t xml:space="preserve">  "compilerOptions": {</w:t>
+      </w:r>
+    </w:p>
+    <w:p>
+      <w:pPr>
+        <w:pStyle w:val="SourceCode"/>
+      </w:pPr>
+      <w:r>
+        <w:t xml:space="preserve">    "target": "ES2022",</w:t>
+      </w:r>
+    </w:p>
+    <w:p>
+      <w:pPr>
+        <w:pStyle w:val="SourceCode"/>
+      </w:pPr>
+      <w:r>
+        <w:t xml:space="preserve">    "module": "NodeNext",</w:t>
+      </w:r>
+    </w:p>
+    <w:p>
+      <w:pPr>
+        <w:pStyle w:val="SourceCode"/>
+      </w:pPr>
+      <w:r>
+        <w:t xml:space="preserve">    "moduleResolution": "NodeNext",</w:t>
+      </w:r>
+    </w:p>
+    <w:p>
+      <w:pPr>
+        <w:pStyle w:val="SourceCode"/>
+      </w:pPr>
+      <w:r>
+        <w:t xml:space="preserve">    "rootDir": "src",</w:t>
+      </w:r>
+    </w:p>
+    <w:p>
+      <w:pPr>
+        <w:pStyle w:val="SourceCode"/>
+      </w:pPr>
+      <w:r>
+        <w:t xml:space="preserve">    "outDir": "dist",</w:t>
+      </w:r>
+    </w:p>
+    <w:p>
+      <w:pPr>
+        <w:pStyle w:val="SourceCode"/>
+      </w:pPr>
+      <w:r>
+        <w:t xml:space="preserve">    "strict": true,</w:t>
+      </w:r>
+    </w:p>
+    <w:p>
+      <w:pPr>
+        <w:pStyle w:val="SourceCode"/>
+      </w:pPr>
+      <w:r>
+        <w:t xml:space="preserve">    "types": [</w:t>
+      </w:r>
+    </w:p>
+    <w:p>
+      <w:pPr>
+        <w:pStyle w:val="SourceCode"/>
+      </w:pPr>
+      <w:r>
+        <w:t xml:space="preserve">      "node"</w:t>
+      </w:r>
+    </w:p>
+    <w:p>
+      <w:pPr>
+        <w:pStyle w:val="SourceCode"/>
+      </w:pPr>
+      <w:r>
+        <w:t xml:space="preserve">    ],</w:t>
+      </w:r>
+    </w:p>
+    <w:p>
+      <w:pPr>
+        <w:pStyle w:val="SourceCode"/>
+      </w:pPr>
+      <w:r>
+        <w:t xml:space="preserve">    "moduleDetection": "force"</w:t>
+      </w:r>
+    </w:p>
+    <w:p>
+      <w:pPr>
+        <w:pStyle w:val="SourceCode"/>
+      </w:pPr>
+      <w:r>
+        <w:t xml:space="preserve">  },</w:t>
+      </w:r>
+    </w:p>
+    <w:p>
+      <w:pPr>
+        <w:pStyle w:val="SourceCode"/>
+      </w:pPr>
+      <w:r>
+        <w:t xml:space="preserve">  "include": [</w:t>
+      </w:r>
+    </w:p>
+    <w:p>
+      <w:pPr>
+        <w:pStyle w:val="SourceCode"/>
+        <w:keepNext/>
+      </w:pPr>
+      <w:r>
+        <w:t xml:space="preserve">    "src/**/*.ts"</w:t>
+      </w:r>
+    </w:p>
+    <w:p>
+      <w:pPr>
+        <w:pStyle w:val="SourceCode"/>
+        <w:keepNext/>
+      </w:pPr>
+      <w:r>
+        <w:t xml:space="preserve">  ]</w:t>
+      </w:r>
+    </w:p>
+    <w:p>
+      <w:pPr>
+        <w:pStyle w:val="SourceCode"/>
+      </w:pPr>
+      <w:r>
+        <w:t>}</w:t>
+      </w:r>
+    </w:p>
+    <w:p>
+      <w:pPr>
+        <w:keepNext/>
+      </w:pPr>
+    </w:p>
+    <w:p>
+      <w:pPr>
+        <w:pStyle w:val="Heading3"/>
+      </w:pPr>
+      <w:r>
         <w:t>Windows PowerShell Library Setup</w:t>
       </w:r>
     </w:p>
@@ -1349,7 +1877,6 @@
     <w:p>
       <w:pPr>
         <w:pStyle w:val="CommandBlock"/>
-        <w:keepNext/>
       </w:pPr>
       <w:r>
         <w:t>&amp; "$env:SystemRoot\System32\curl.exe" -fsSL -o .\cpp\nlohmann\json.hpp `</w:t>
@@ -1358,7 +1885,6 @@
     <w:p>
       <w:pPr>
         <w:pStyle w:val="CommandBlock"/>
-        <w:keepNext/>
       </w:pPr>
       <w:r>
         <w:t xml:space="preserve">    https://github.com/nlohmann/json/releases/download/v3.12.0/json.hpp</w:t>
@@ -1367,7 +1893,6 @@
     <w:p>
       <w:pPr>
         <w:pStyle w:val="CommandBlock"/>
-        <w:keepNext/>
       </w:pPr>
       <w:r>
         <w:t>py -m venv .\python\.venv</w:t>
@@ -1376,7 +1901,6 @@
     <w:p>
       <w:pPr>
         <w:pStyle w:val="CommandBlock"/>
-        <w:keepNext/>
       </w:pPr>
       <w:r>
         <w:t>.\python\.venv\Scripts\python.exe -m pip install -r .\python\requirements.txt</w:t>
@@ -1387,7 +1911,89 @@
         <w:pStyle w:val="CommandBlock"/>
       </w:pPr>
       <w:r>
-        <w:t>npm --prefix .\typescript install --ignore-scripts --no-audit --no-fund</w:t>
+        <w:t>Push-Location .\typescript</w:t>
+      </w:r>
+    </w:p>
+    <w:p>
+      <w:pPr>
+        <w:pStyle w:val="CommandBlock"/>
+      </w:pPr>
+      <w:r>
+        <w:t>npm init -y</w:t>
+      </w:r>
+    </w:p>
+    <w:p>
+      <w:pPr>
+        <w:pStyle w:val="CommandBlock"/>
+      </w:pPr>
+      <w:r>
+        <w:t>npm pkg set name=web-setup-typescript type=module</w:t>
+      </w:r>
+    </w:p>
+    <w:p>
+      <w:pPr>
+        <w:pStyle w:val="CommandBlock"/>
+      </w:pPr>
+      <w:r>
+        <w:t>npm pkg set private=true --json</w:t>
+      </w:r>
+    </w:p>
+    <w:p>
+      <w:pPr>
+        <w:pStyle w:val="CommandBlock"/>
+      </w:pPr>
+      <w:r>
+        <w:t>npm pkg set "scripts.check=tsc --noEmit" "scripts.build=tsc --noEmitOnError"</w:t>
+      </w:r>
+    </w:p>
+    <w:p>
+      <w:pPr>
+        <w:pStyle w:val="CommandBlock"/>
+      </w:pPr>
+      <w:r>
+        <w:t>npm pkg delete version description main keywords author license scripts.test</w:t>
+      </w:r>
+    </w:p>
+    <w:p>
+      <w:pPr>
+        <w:pStyle w:val="CommandBlock"/>
+      </w:pPr>
+      <w:r>
+        <w:t>npm install --save-exact express@5.2.1 ejs@7.0.1 `</w:t>
+      </w:r>
+    </w:p>
+    <w:p>
+      <w:pPr>
+        <w:pStyle w:val="CommandBlock"/>
+      </w:pPr>
+      <w:r>
+        <w:t xml:space="preserve">    --ignore-scripts --no-audit --no-fund</w:t>
+      </w:r>
+    </w:p>
+    <w:p>
+      <w:pPr>
+        <w:pStyle w:val="CommandBlock"/>
+        <w:keepNext/>
+      </w:pPr>
+      <w:r>
+        <w:t>npm install --save-dev --save-exact typescript@7.0.2 @types/node@24.13.5 `</w:t>
+      </w:r>
+    </w:p>
+    <w:p>
+      <w:pPr>
+        <w:pStyle w:val="CommandBlock"/>
+        <w:keepNext/>
+      </w:pPr>
+      <w:r>
+        <w:t xml:space="preserve">    @types/express@5.0.6 --ignore-scripts --no-audit --no-fund</w:t>
+      </w:r>
+    </w:p>
+    <w:p>
+      <w:pPr>
+        <w:pStyle w:val="CommandBlock"/>
+      </w:pPr>
+      <w:r>
+        <w:t>Pop-Location</w:t>
       </w:r>
     </w:p>
     <w:p>
@@ -1596,6 +2202,19 @@
     </w:p>
     <w:p>
       <w:pPr>
+        <w:keepNext/>
+      </w:pPr>
+      <w:r>
+        <w:t>Type python/requirements.txt and typescript/tsconfig.json exactly as shown in the Windows setup. On Linux, cd moves into ./typescript for the npm lines, and cd .. moves back.</w:t>
+      </w:r>
+    </w:p>
+    <w:p>
+      <w:pPr>
+        <w:keepNext/>
+      </w:pPr>
+    </w:p>
+    <w:p>
+      <w:pPr>
         <w:pStyle w:val="CommandBlock"/>
         <w:keepNext/>
       </w:pPr>
@@ -1615,7 +2234,6 @@
     <w:p>
       <w:pPr>
         <w:pStyle w:val="CommandBlock"/>
-        <w:keepNext/>
       </w:pPr>
       <w:r>
         <w:t>curl -fsSL -o ./cpp/nlohmann/json.hpp \</w:t>
@@ -1624,7 +2242,6 @@
     <w:p>
       <w:pPr>
         <w:pStyle w:val="CommandBlock"/>
-        <w:keepNext/>
       </w:pPr>
       <w:r>
         <w:t xml:space="preserve">    https://github.com/nlohmann/json/releases/download/v3.12.0/json.hpp</w:t>
@@ -1633,7 +2250,6 @@
     <w:p>
       <w:pPr>
         <w:pStyle w:val="CommandBlock"/>
-        <w:keepNext/>
       </w:pPr>
       <w:r>
         <w:t>sha256sum ./cpp/inja.hpp ./cpp/nlohmann/json.hpp</w:t>
@@ -1642,7 +2258,6 @@
     <w:p>
       <w:pPr>
         <w:pStyle w:val="CommandBlock"/>
-        <w:keepNext/>
       </w:pPr>
       <w:r>
         <w:t>python3 -m venv ./python/.venv</w:t>
@@ -1651,7 +2266,6 @@
     <w:p>
       <w:pPr>
         <w:pStyle w:val="CommandBlock"/>
-        <w:keepNext/>
       </w:pPr>
       <w:r>
         <w:t>./python/.venv/bin/python -m pip install -r ./python/requirements.txt</w:t>
@@ -1660,7 +2274,6 @@
     <w:p>
       <w:pPr>
         <w:pStyle w:val="CommandBlock"/>
-        <w:keepNext/>
       </w:pPr>
       <w:r>
         <w:t>./python/.venv/bin/python -m pip freeze</w:t>
@@ -1671,7 +2284,89 @@
         <w:pStyle w:val="CommandBlock"/>
       </w:pPr>
       <w:r>
-        <w:t>npm --prefix ./typescript install --ignore-scripts --no-audit --no-fund</w:t>
+        <w:t>cd ./typescript</w:t>
+      </w:r>
+    </w:p>
+    <w:p>
+      <w:pPr>
+        <w:pStyle w:val="CommandBlock"/>
+      </w:pPr>
+      <w:r>
+        <w:t>npm init -y</w:t>
+      </w:r>
+    </w:p>
+    <w:p>
+      <w:pPr>
+        <w:pStyle w:val="CommandBlock"/>
+      </w:pPr>
+      <w:r>
+        <w:t>npm pkg set name=web-setup-typescript type=module</w:t>
+      </w:r>
+    </w:p>
+    <w:p>
+      <w:pPr>
+        <w:pStyle w:val="CommandBlock"/>
+      </w:pPr>
+      <w:r>
+        <w:t>npm pkg set private=true --json</w:t>
+      </w:r>
+    </w:p>
+    <w:p>
+      <w:pPr>
+        <w:pStyle w:val="CommandBlock"/>
+      </w:pPr>
+      <w:r>
+        <w:t>npm pkg set "scripts.check=tsc --noEmit" "scripts.build=tsc --noEmitOnError"</w:t>
+      </w:r>
+    </w:p>
+    <w:p>
+      <w:pPr>
+        <w:pStyle w:val="CommandBlock"/>
+      </w:pPr>
+      <w:r>
+        <w:t>npm pkg delete version description main keywords author license scripts.test</w:t>
+      </w:r>
+    </w:p>
+    <w:p>
+      <w:pPr>
+        <w:pStyle w:val="CommandBlock"/>
+      </w:pPr>
+      <w:r>
+        <w:t>npm install --save-exact express@5.2.1 ejs@7.0.1 \</w:t>
+      </w:r>
+    </w:p>
+    <w:p>
+      <w:pPr>
+        <w:pStyle w:val="CommandBlock"/>
+      </w:pPr>
+      <w:r>
+        <w:t xml:space="preserve">    --ignore-scripts --no-audit --no-fund</w:t>
+      </w:r>
+    </w:p>
+    <w:p>
+      <w:pPr>
+        <w:pStyle w:val="CommandBlock"/>
+        <w:keepNext/>
+      </w:pPr>
+      <w:r>
+        <w:t>npm install --save-dev --save-exact typescript@7.0.2 @types/node@24.13.5 \</w:t>
+      </w:r>
+    </w:p>
+    <w:p>
+      <w:pPr>
+        <w:pStyle w:val="CommandBlock"/>
+        <w:keepNext/>
+      </w:pPr>
+      <w:r>
+        <w:t xml:space="preserve">    @types/express@5.0.6 --ignore-scripts --no-audit --no-fund</w:t>
+      </w:r>
+    </w:p>
+    <w:p>
+      <w:pPr>
+        <w:pStyle w:val="CommandBlock"/>
+      </w:pPr>
+      <w:r>
+        <w:t>cd ..</w:t>
       </w:r>
     </w:p>
     <w:p>
@@ -11284,10 +11979,10 @@
     </w:p>
     <w:p>
       <w:r>
-        <w:t>The two .csproj files are Lesson 6.0's server project file: Microsoft.NET.Sdk.Web brings in ASP.NET Core and Razor, and RunWorkingDirectory starts the program in the folder dotnet run is typed in. go.mod names this lesson's Go module. requirements.txt pins Flask and the six packages it needs, each to one exact version (Lesson 2.17), so pip installs the same set every time. package.json pins Express and EJS as dependencies, needed when the program runs: Express loads EJS itself, by the name the view engine s</w:t>
-      </w:r>
-      <w:r>
-        <w:t>etting gives, ejs. Express's types and the compiler are devDependencies, needed only to build; @types/express 5.0.6 matches Express 5. @types/node stays the course's pin, 24.13.5, matching Node 24. tsconfig.json is Chapter 7's.</w:t>
+        <w:t>These are the files the setup commands wrote, shown here so you can check yours. Your go line shows your own Go version, and the blank lines and the order of the package.json fields may differ. go.mod names this lesson's Go module. package.json pins Express and EJS as dependencies, needed when the program runs: Express loads EJS itself, by the name the view engine setting gives, ejs. Express's types and the compiler are devDependencies, needed only to build; @types/express 5.0.6 matches Express 5. @types/no</w:t>
+      </w:r>
+      <w:r>
+        <w:t>de stays the course's pin, 24.13.5, matching Node 24.</w:t>
       </w:r>
     </w:p>
     <w:p>
@@ -11305,87 +12000,30 @@
         <w:pStyle w:val="Heading2"/>
       </w:pPr>
       <w:r>
-        <w:t>csharp/BasicTemplateCheck/BasicTemplateCheck.csproj</w:t>
-      </w:r>
-    </w:p>
-    <w:p>
-      <w:pPr>
-        <w:pStyle w:val="SourceCode"/>
-        <w:keepNext/>
-      </w:pPr>
-      <w:r>
-        <w:t>&lt;Project Sdk="Microsoft.NET.Sdk.Web"&gt;</w:t>
-      </w:r>
-    </w:p>
-    <w:p>
-      <w:pPr>
-        <w:pStyle w:val="SourceCode"/>
-        <w:keepNext/>
-      </w:pPr>
-      <w:r>
-        <w:t xml:space="preserve">  &lt;PropertyGroup&gt;</w:t>
-      </w:r>
-    </w:p>
-    <w:p>
-      <w:pPr>
-        <w:pStyle w:val="SourceCode"/>
-        <w:keepNext/>
-      </w:pPr>
-      <w:r>
-        <w:t xml:space="preserve">    &lt;OutputType&gt;Exe&lt;/OutputType&gt;</w:t>
-      </w:r>
-    </w:p>
-    <w:p>
-      <w:pPr>
-        <w:pStyle w:val="SourceCode"/>
-        <w:keepNext/>
-      </w:pPr>
-      <w:r>
-        <w:t xml:space="preserve">    &lt;TargetFramework&gt;net10.0&lt;/TargetFramework&gt;</w:t>
-      </w:r>
-    </w:p>
-    <w:p>
-      <w:pPr>
-        <w:pStyle w:val="SourceCode"/>
-        <w:keepNext/>
-      </w:pPr>
-      <w:r>
-        <w:t xml:space="preserve">    &lt;ImplicitUsings&gt;enable&lt;/ImplicitUsings&gt;</w:t>
-      </w:r>
-    </w:p>
-    <w:p>
-      <w:pPr>
-        <w:pStyle w:val="SourceCode"/>
-        <w:keepNext/>
-      </w:pPr>
-      <w:r>
-        <w:t xml:space="preserve">    &lt;Nullable&gt;enable&lt;/Nullable&gt;</w:t>
-      </w:r>
-    </w:p>
-    <w:p>
-      <w:pPr>
-        <w:pStyle w:val="SourceCode"/>
-        <w:keepNext/>
-      </w:pPr>
-      <w:r>
-        <w:t xml:space="preserve">    &lt;RunWorkingDirectory&gt;$(MSBuildStartupDirectory)&lt;/RunWorkingDirectory&gt;</w:t>
-      </w:r>
-    </w:p>
-    <w:p>
-      <w:pPr>
-        <w:pStyle w:val="SourceCode"/>
-        <w:keepNext/>
-      </w:pPr>
-      <w:r>
-        <w:t xml:space="preserve">  &lt;/PropertyGroup&gt;</w:t>
-      </w:r>
-    </w:p>
-    <w:p>
-      <w:pPr>
-        <w:pStyle w:val="SourceCode"/>
-      </w:pPr>
-      <w:r>
-        <w:t>&lt;/Project&gt;</w:t>
+        <w:t>go/go.mod</w:t>
+      </w:r>
+    </w:p>
+    <w:p>
+      <w:pPr>
+        <w:pStyle w:val="SourceCode"/>
+        <w:keepNext/>
+      </w:pPr>
+      <w:r>
+        <w:t>module example.com/websetup</w:t>
+      </w:r>
+    </w:p>
+    <w:p>
+      <w:pPr>
+        <w:pStyle w:val="SourceCode"/>
+        <w:keepNext/>
+      </w:pPr>
+    </w:p>
+    <w:p>
+      <w:pPr>
+        <w:pStyle w:val="SourceCode"/>
+      </w:pPr>
+      <w:r>
+        <w:t>go 1.24.0</w:t>
       </w:r>
     </w:p>
     <w:p>
@@ -11403,225 +12041,6 @@
         <w:pStyle w:val="Heading2"/>
       </w:pPr>
       <w:r>
-        <w:t>csharp/TemplateCheck/TemplateCheck.csproj</w:t>
-      </w:r>
-    </w:p>
-    <w:p>
-      <w:pPr>
-        <w:pStyle w:val="SourceCode"/>
-        <w:keepNext/>
-      </w:pPr>
-      <w:r>
-        <w:t>&lt;Project Sdk="Microsoft.NET.Sdk.Web"&gt;</w:t>
-      </w:r>
-    </w:p>
-    <w:p>
-      <w:pPr>
-        <w:pStyle w:val="SourceCode"/>
-        <w:keepNext/>
-      </w:pPr>
-      <w:r>
-        <w:t xml:space="preserve">  &lt;PropertyGroup&gt;</w:t>
-      </w:r>
-    </w:p>
-    <w:p>
-      <w:pPr>
-        <w:pStyle w:val="SourceCode"/>
-        <w:keepNext/>
-      </w:pPr>
-      <w:r>
-        <w:t xml:space="preserve">    &lt;OutputType&gt;Exe&lt;/OutputType&gt;</w:t>
-      </w:r>
-    </w:p>
-    <w:p>
-      <w:pPr>
-        <w:pStyle w:val="SourceCode"/>
-        <w:keepNext/>
-      </w:pPr>
-      <w:r>
-        <w:t xml:space="preserve">    &lt;TargetFramework&gt;net10.0&lt;/TargetFramework&gt;</w:t>
-      </w:r>
-    </w:p>
-    <w:p>
-      <w:pPr>
-        <w:pStyle w:val="SourceCode"/>
-        <w:keepNext/>
-      </w:pPr>
-      <w:r>
-        <w:t xml:space="preserve">    &lt;ImplicitUsings&gt;enable&lt;/ImplicitUsings&gt;</w:t>
-      </w:r>
-    </w:p>
-    <w:p>
-      <w:pPr>
-        <w:pStyle w:val="SourceCode"/>
-        <w:keepNext/>
-      </w:pPr>
-      <w:r>
-        <w:t xml:space="preserve">    &lt;Nullable&gt;enable&lt;/Nullable&gt;</w:t>
-      </w:r>
-    </w:p>
-    <w:p>
-      <w:pPr>
-        <w:pStyle w:val="SourceCode"/>
-        <w:keepNext/>
-      </w:pPr>
-      <w:r>
-        <w:t xml:space="preserve">    &lt;RunWorkingDirectory&gt;$(MSBuildStartupDirectory)&lt;/RunWorkingDirectory&gt;</w:t>
-      </w:r>
-    </w:p>
-    <w:p>
-      <w:pPr>
-        <w:pStyle w:val="SourceCode"/>
-        <w:keepNext/>
-      </w:pPr>
-      <w:r>
-        <w:t xml:space="preserve">  &lt;/PropertyGroup&gt;</w:t>
-      </w:r>
-    </w:p>
-    <w:p>
-      <w:pPr>
-        <w:pStyle w:val="SourceCode"/>
-      </w:pPr>
-      <w:r>
-        <w:t>&lt;/Project&gt;</w:t>
-      </w:r>
-    </w:p>
-    <w:p>
-      <w:pPr>
-        <w:keepNext/>
-      </w:pPr>
-    </w:p>
-    <w:p>
-      <w:pPr>
-        <w:keepNext/>
-      </w:pPr>
-    </w:p>
-    <w:p>
-      <w:pPr>
-        <w:pStyle w:val="Heading2"/>
-      </w:pPr>
-      <w:r>
-        <w:t>go/go.mod</w:t>
-      </w:r>
-    </w:p>
-    <w:p>
-      <w:pPr>
-        <w:pStyle w:val="SourceCode"/>
-        <w:keepNext/>
-      </w:pPr>
-      <w:r>
-        <w:t>module example.com/websetup</w:t>
-      </w:r>
-    </w:p>
-    <w:p>
-      <w:pPr>
-        <w:pStyle w:val="SourceCode"/>
-        <w:keepNext/>
-      </w:pPr>
-    </w:p>
-    <w:p>
-      <w:pPr>
-        <w:pStyle w:val="SourceCode"/>
-      </w:pPr>
-      <w:r>
-        <w:t>go 1.24.0</w:t>
-      </w:r>
-    </w:p>
-    <w:p>
-      <w:pPr>
-        <w:keepNext/>
-      </w:pPr>
-    </w:p>
-    <w:p>
-      <w:pPr>
-        <w:keepNext/>
-      </w:pPr>
-    </w:p>
-    <w:p>
-      <w:pPr>
-        <w:pStyle w:val="Heading2"/>
-      </w:pPr>
-      <w:r>
-        <w:t>python/requirements.txt</w:t>
-      </w:r>
-    </w:p>
-    <w:p>
-      <w:pPr>
-        <w:pStyle w:val="SourceCode"/>
-        <w:keepNext/>
-      </w:pPr>
-      <w:r>
-        <w:t>Flask==3.1.3</w:t>
-      </w:r>
-    </w:p>
-    <w:p>
-      <w:pPr>
-        <w:pStyle w:val="SourceCode"/>
-        <w:keepNext/>
-      </w:pPr>
-      <w:r>
-        <w:t>Werkzeug==3.1.9</w:t>
-      </w:r>
-    </w:p>
-    <w:p>
-      <w:pPr>
-        <w:pStyle w:val="SourceCode"/>
-        <w:keepNext/>
-      </w:pPr>
-      <w:r>
-        <w:t>Jinja2==3.1.6</w:t>
-      </w:r>
-    </w:p>
-    <w:p>
-      <w:pPr>
-        <w:pStyle w:val="SourceCode"/>
-        <w:keepNext/>
-      </w:pPr>
-      <w:r>
-        <w:t>MarkupSafe==3.0.4</w:t>
-      </w:r>
-    </w:p>
-    <w:p>
-      <w:pPr>
-        <w:pStyle w:val="SourceCode"/>
-        <w:keepNext/>
-      </w:pPr>
-      <w:r>
-        <w:t>itsdangerous==2.2.0</w:t>
-      </w:r>
-    </w:p>
-    <w:p>
-      <w:pPr>
-        <w:pStyle w:val="SourceCode"/>
-        <w:keepNext/>
-      </w:pPr>
-      <w:r>
-        <w:t>click==8.5.0</w:t>
-      </w:r>
-    </w:p>
-    <w:p>
-      <w:pPr>
-        <w:pStyle w:val="SourceCode"/>
-      </w:pPr>
-      <w:r>
-        <w:t>blinker==1.9.0</w:t>
-      </w:r>
-    </w:p>
-    <w:p>
-      <w:pPr>
-        <w:keepNext/>
-      </w:pPr>
-    </w:p>
-    <w:p>
-      <w:pPr>
-        <w:keepNext/>
-      </w:pPr>
-    </w:p>
-    <w:p>
-      <w:pPr>
-        <w:pStyle w:val="Heading2"/>
-      </w:pPr>
-      <w:r>
         <w:t>typescript/package.json</w:t>
       </w:r>
     </w:p>
@@ -11763,164 +12182,6 @@
       </w:pPr>
       <w:r>
         <w:t xml:space="preserve">  }</w:t>
-      </w:r>
-    </w:p>
-    <w:p>
-      <w:pPr>
-        <w:pStyle w:val="SourceCode"/>
-      </w:pPr>
-      <w:r>
-        <w:t>}</w:t>
-      </w:r>
-    </w:p>
-    <w:p>
-      <w:pPr>
-        <w:keepNext/>
-      </w:pPr>
-    </w:p>
-    <w:p>
-      <w:pPr>
-        <w:keepNext/>
-      </w:pPr>
-    </w:p>
-    <w:p>
-      <w:pPr>
-        <w:pStyle w:val="Heading2"/>
-      </w:pPr>
-      <w:r>
-        <w:t>typescript/tsconfig.json</w:t>
-      </w:r>
-    </w:p>
-    <w:p>
-      <w:pPr>
-        <w:pStyle w:val="SourceCode"/>
-        <w:keepNext/>
-      </w:pPr>
-      <w:r>
-        <w:t>{</w:t>
-      </w:r>
-    </w:p>
-    <w:p>
-      <w:pPr>
-        <w:pStyle w:val="SourceCode"/>
-        <w:keepNext/>
-      </w:pPr>
-      <w:r>
-        <w:t xml:space="preserve">  "compilerOptions": {</w:t>
-      </w:r>
-    </w:p>
-    <w:p>
-      <w:pPr>
-        <w:pStyle w:val="SourceCode"/>
-      </w:pPr>
-      <w:r>
-        <w:t xml:space="preserve">    "target": "ES2022",</w:t>
-      </w:r>
-    </w:p>
-    <w:p>
-      <w:pPr>
-        <w:pStyle w:val="SourceCode"/>
-      </w:pPr>
-      <w:r>
-        <w:t xml:space="preserve">    "module": "NodeNext",</w:t>
-      </w:r>
-    </w:p>
-    <w:p>
-      <w:pPr>
-        <w:pStyle w:val="SourceCode"/>
-      </w:pPr>
-      <w:r>
-        <w:t xml:space="preserve">    "moduleResolution": "NodeNext",</w:t>
-      </w:r>
-    </w:p>
-    <w:p>
-      <w:pPr>
-        <w:pStyle w:val="SourceCode"/>
-      </w:pPr>
-      <w:r>
-        <w:t xml:space="preserve">    "rootDir": "src",</w:t>
-      </w:r>
-    </w:p>
-    <w:p>
-      <w:pPr>
-        <w:pStyle w:val="SourceCode"/>
-      </w:pPr>
-      <w:r>
-        <w:t xml:space="preserve">    "outDir": "dist",</w:t>
-      </w:r>
-    </w:p>
-    <w:p>
-      <w:pPr>
-        <w:pStyle w:val="SourceCode"/>
-      </w:pPr>
-      <w:r>
-        <w:t xml:space="preserve">    "strict": true,</w:t>
-      </w:r>
-    </w:p>
-    <w:p>
-      <w:pPr>
-        <w:pStyle w:val="SourceCode"/>
-      </w:pPr>
-      <w:r>
-        <w:t xml:space="preserve">    "types": [</w:t>
-      </w:r>
-    </w:p>
-    <w:p>
-      <w:pPr>
-        <w:pStyle w:val="SourceCode"/>
-      </w:pPr>
-      <w:r>
-        <w:t xml:space="preserve">      "node"</w:t>
-      </w:r>
-    </w:p>
-    <w:p>
-      <w:pPr>
-        <w:pStyle w:val="SourceCode"/>
-      </w:pPr>
-      <w:r>
-        <w:t xml:space="preserve">    ],</w:t>
-      </w:r>
-    </w:p>
-    <w:p>
-      <w:pPr>
-        <w:pStyle w:val="SourceCode"/>
-      </w:pPr>
-      <w:r>
-        <w:t xml:space="preserve">    "moduleDetection": "force"</w:t>
-      </w:r>
-    </w:p>
-    <w:p>
-      <w:pPr>
-        <w:pStyle w:val="SourceCode"/>
-      </w:pPr>
-      <w:r>
-        <w:t xml:space="preserve">  },</w:t>
-      </w:r>
-    </w:p>
-    <w:p>
-      <w:pPr>
-        <w:pStyle w:val="SourceCode"/>
-      </w:pPr>
-      <w:r>
-        <w:t xml:space="preserve">  "include": [</w:t>
-      </w:r>
-    </w:p>
-    <w:p>
-      <w:pPr>
-        <w:pStyle w:val="SourceCode"/>
-        <w:keepNext/>
-      </w:pPr>
-      <w:r>
-        <w:t xml:space="preserve">    "src/**/*.ts"</w:t>
-      </w:r>
-    </w:p>
-    <w:p>
-      <w:pPr>
-        <w:pStyle w:val="SourceCode"/>
-        <w:keepNext/>
-      </w:pPr>
-      <w:r>
-        <w:t xml:space="preserve">  ]</w:t>
       </w:r>
     </w:p>
     <w:p>
@@ -12776,31 +13037,31 @@
       </w:rPr>
     </w:lvl>
   </w:abstractNum>
-  <w:num w:numId="1" w16cid:durableId="329677572">
+  <w:num w:numId="1" w16cid:durableId="1111439965">
     <w:abstractNumId w:val="8"/>
   </w:num>
-  <w:num w:numId="2" w16cid:durableId="1712916438">
+  <w:num w:numId="2" w16cid:durableId="145636670">
     <w:abstractNumId w:val="6"/>
   </w:num>
-  <w:num w:numId="3" w16cid:durableId="1492142877">
+  <w:num w:numId="3" w16cid:durableId="814834804">
     <w:abstractNumId w:val="5"/>
   </w:num>
-  <w:num w:numId="4" w16cid:durableId="40718317">
+  <w:num w:numId="4" w16cid:durableId="755591338">
     <w:abstractNumId w:val="4"/>
   </w:num>
-  <w:num w:numId="5" w16cid:durableId="841551894">
+  <w:num w:numId="5" w16cid:durableId="1516797443">
     <w:abstractNumId w:val="7"/>
   </w:num>
-  <w:num w:numId="6" w16cid:durableId="1852405412">
+  <w:num w:numId="6" w16cid:durableId="548687572">
     <w:abstractNumId w:val="3"/>
   </w:num>
-  <w:num w:numId="7" w16cid:durableId="245768854">
+  <w:num w:numId="7" w16cid:durableId="1859655311">
     <w:abstractNumId w:val="2"/>
   </w:num>
-  <w:num w:numId="8" w16cid:durableId="1463495525">
+  <w:num w:numId="8" w16cid:durableId="2137750699">
     <w:abstractNumId w:val="1"/>
   </w:num>
-  <w:num w:numId="9" w16cid:durableId="1808544716">
+  <w:num w:numId="9" w16cid:durableId="2133401024">
     <w:abstractNumId w:val="0"/>
   </w:num>
 </w:numbering>

</xml_diff>

<commit_message>
Volume 1, Chapter 8: updated lessons
</commit_message>
<xml_diff>
--- a/Volume 1/Chapter 08 - Web Applications/SPA_Vol1_Ch8_Lesson8_0_Web_Setup.docx
+++ b/Volume 1/Chapter 08 - Web Applications/SPA_Vol1_Ch8_Lesson8_0_Web_Setup.docx
@@ -3296,23 +3296,23 @@
         <w:pStyle w:val="SourceCode"/>
       </w:pPr>
       <w:r>
-        <w:t>// Read a whole small text file into contents. Returns 1 on success, 0 if</w:t>
-      </w:r>
-    </w:p>
-    <w:p>
-      <w:pPr>
-        <w:pStyle w:val="SourceCode"/>
-      </w:pPr>
-      <w:r>
-        <w:t>// the file cannot be opened or does not fit. Remember, "r" reads text, so</w:t>
-      </w:r>
-    </w:p>
-    <w:p>
-      <w:pPr>
-        <w:pStyle w:val="SourceCode"/>
-      </w:pPr>
-      <w:r>
-        <w:t>// a Windows line ending arrives as \n (Lesson 3.2).</w:t>
+        <w:t>// Read a whole small text file into contents: 1 on success, 0 if it cannot</w:t>
+      </w:r>
+    </w:p>
+    <w:p>
+      <w:pPr>
+        <w:pStyle w:val="SourceCode"/>
+      </w:pPr>
+      <w:r>
+        <w:t>// be opened or does not fit. Remember, feof: the end was reached; "r" reads</w:t>
+      </w:r>
+    </w:p>
+    <w:p>
+      <w:pPr>
+        <w:pStyle w:val="SourceCode"/>
+      </w:pPr>
+      <w:r>
+        <w:t>// text, so a Windows line ending arrives as \n (Lesson 3.2).</w:t>
       </w:r>
     </w:p>
     <w:p>
@@ -3445,31 +3445,31 @@
         <w:pStyle w:val="SourceCode"/>
       </w:pPr>
       <w:r>
-        <w:t>// Each one is written as its HTML escape instead, such as &amp;amp; for &amp;,</w:t>
-      </w:r>
-    </w:p>
-    <w:p>
-      <w:pPr>
-        <w:pStyle w:val="SourceCode"/>
-      </w:pPr>
-      <w:r>
-        <w:t>// which a browser shows as the character itself. A template library does</w:t>
-      </w:r>
-    </w:p>
-    <w:p>
-      <w:pPr>
-        <w:pStyle w:val="SourceCode"/>
-      </w:pPr>
-      <w:r>
-        <w:t>// this for you; C has none, so this program does it. Lesson 8.3 shows</w:t>
-      </w:r>
-    </w:p>
-    <w:p>
-      <w:pPr>
-        <w:pStyle w:val="SourceCode"/>
-      </w:pPr>
-      <w:r>
-        <w:t>// what goes wrong without it.</w:t>
+        <w:t>// Each is written as its HTML escape instead, such as &amp;amp; for &amp;, which a</w:t>
+      </w:r>
+    </w:p>
+    <w:p>
+      <w:pPr>
+        <w:pStyle w:val="SourceCode"/>
+      </w:pPr>
+      <w:r>
+        <w:t>// browser shows as the character itself. In '\'', a backslash keeps the</w:t>
+      </w:r>
+    </w:p>
+    <w:p>
+      <w:pPr>
+        <w:pStyle w:val="SourceCode"/>
+      </w:pPr>
+      <w:r>
+        <w:t>// middle ' from ending the character; putchar prints one character.</w:t>
+      </w:r>
+    </w:p>
+    <w:p>
+      <w:pPr>
+        <w:pStyle w:val="SourceCode"/>
+      </w:pPr>
+      <w:r>
+        <w:t>// A template library does this; C has none (Lesson 8.3 shows why it matters).</w:t>
       </w:r>
     </w:p>
     <w:p>
@@ -4232,23 +4232,23 @@
         <w:pStyle w:val="SourceCode"/>
       </w:pPr>
       <w:r>
-        <w:t>// Read the template into contents. Returns NULL on success, or the reason</w:t>
-      </w:r>
-    </w:p>
-    <w:p>
-      <w:pPr>
-        <w:pStyle w:val="SourceCode"/>
-      </w:pPr>
-      <w:r>
-        <w:t>// it failed. Remember, a failed fopen stores the reason in errno, and</w:t>
-      </w:r>
-    </w:p>
-    <w:p>
-      <w:pPr>
-        <w:pStyle w:val="SourceCode"/>
-      </w:pPr>
-      <w:r>
-        <w:t>// strerror gives the system's words for it (Lesson 3.19).</w:t>
+        <w:t>// Read the template into contents: NULL on success, or why it failed.</w:t>
+      </w:r>
+    </w:p>
+    <w:p>
+      <w:pPr>
+        <w:pStyle w:val="SourceCode"/>
+      </w:pPr>
+      <w:r>
+        <w:t>// Remember, a failed fopen stores the reason in errno, and strerror gives</w:t>
+      </w:r>
+    </w:p>
+    <w:p>
+      <w:pPr>
+        <w:pStyle w:val="SourceCode"/>
+      </w:pPr>
+      <w:r>
+        <w:t>// the system's words for it (Lesson 3.19); feof: the end was reached.</w:t>
       </w:r>
     </w:p>
     <w:p>
@@ -6684,16 +6684,16 @@
         <w:keepNext/>
       </w:pPr>
       <w:r>
-        <w:t>@* A Razor component: C#'s template. The HTML is the page's fixed</w:t>
-      </w:r>
-    </w:p>
-    <w:p>
-      <w:pPr>
-        <w:pStyle w:val="SourceCode"/>
-        <w:keepNext/>
-      </w:pPr>
-      <w:r>
-        <w:t xml:space="preserve">   structure; @Name writes the Name parameter into it, escaped. *@</w:t>
+        <w:t>@* A Razor comment: the build leaves it out of the page. A component is</w:t>
+      </w:r>
+    </w:p>
+    <w:p>
+      <w:pPr>
+        <w:pStyle w:val="SourceCode"/>
+        <w:keepNext/>
+      </w:pPr>
+      <w:r>
+        <w:t xml:space="preserve">   C#'s template: fixed HTML, and @Name writes the Name parameter, escaped. *@</w:t>
       </w:r>
     </w:p>
     <w:p>
@@ -6726,34 +6726,34 @@
         <w:keepNext/>
       </w:pPr>
       <w:r>
-        <w:t xml:space="preserve">    // A parameter is a value passed in by the code that renders the</w:t>
-      </w:r>
-    </w:p>
-    <w:p>
-      <w:pPr>
-        <w:pStyle w:val="SourceCode"/>
-        <w:keepNext/>
-      </w:pPr>
-      <w:r>
-        <w:t xml:space="preserve">    // component; [Parameter] marks it. Razor needs it as a property: a</w:t>
-      </w:r>
-    </w:p>
-    <w:p>
-      <w:pPr>
-        <w:pStyle w:val="SourceCode"/>
-        <w:keepNext/>
-      </w:pPr>
-      <w:r>
-        <w:t xml:space="preserve">    // value other code reads with get and sets with set.</w:t>
-      </w:r>
-    </w:p>
-    <w:p>
-      <w:pPr>
-        <w:pStyle w:val="SourceCode"/>
-        <w:keepNext/>
-      </w:pPr>
-      <w:r>
-        <w:t xml:space="preserve">    // It starts empty until it is given a value.</w:t>
+        <w:t xml:space="preserve">    // @code holds the component's C#. A parameter is a value passed in by</w:t>
+      </w:r>
+    </w:p>
+    <w:p>
+      <w:pPr>
+        <w:pStyle w:val="SourceCode"/>
+        <w:keepNext/>
+      </w:pPr>
+      <w:r>
+        <w:t xml:space="preserve">    // the code that renders it; [Parameter] marks it. Razor needs it as a</w:t>
+      </w:r>
+    </w:p>
+    <w:p>
+      <w:pPr>
+        <w:pStyle w:val="SourceCode"/>
+        <w:keepNext/>
+      </w:pPr>
+      <w:r>
+        <w:t xml:space="preserve">    // property: a value other code reads with get and sets with set. It</w:t>
+      </w:r>
+    </w:p>
+    <w:p>
+      <w:pPr>
+        <w:pStyle w:val="SourceCode"/>
+        <w:keepNext/>
+      </w:pPr>
+      <w:r>
+        <w:t xml:space="preserve">    // starts empty until it is given a value.</w:t>
       </w:r>
     </w:p>
     <w:p>
@@ -7320,16 +7320,16 @@
         <w:keepNext/>
       </w:pPr>
       <w:r>
-        <w:t>@* A Razor component: C#'s template. The HTML is the page's fixed</w:t>
-      </w:r>
-    </w:p>
-    <w:p>
-      <w:pPr>
-        <w:pStyle w:val="SourceCode"/>
-        <w:keepNext/>
-      </w:pPr>
-      <w:r>
-        <w:t xml:space="preserve">   structure; @Name writes the Name parameter into it, escaped. *@</w:t>
+        <w:t>@* A Razor comment: the build leaves it out of the page. A component is</w:t>
+      </w:r>
+    </w:p>
+    <w:p>
+      <w:pPr>
+        <w:pStyle w:val="SourceCode"/>
+        <w:keepNext/>
+      </w:pPr>
+      <w:r>
+        <w:t xml:space="preserve">   C#'s template: fixed HTML, and @Name writes the Name parameter, escaped. *@</w:t>
       </w:r>
     </w:p>
     <w:p>
@@ -7362,34 +7362,34 @@
         <w:keepNext/>
       </w:pPr>
       <w:r>
-        <w:t xml:space="preserve">    // A parameter is a value passed in by the code that renders the</w:t>
-      </w:r>
-    </w:p>
-    <w:p>
-      <w:pPr>
-        <w:pStyle w:val="SourceCode"/>
-        <w:keepNext/>
-      </w:pPr>
-      <w:r>
-        <w:t xml:space="preserve">    // component; [Parameter] marks it. Razor needs it as a property: a</w:t>
-      </w:r>
-    </w:p>
-    <w:p>
-      <w:pPr>
-        <w:pStyle w:val="SourceCode"/>
-        <w:keepNext/>
-      </w:pPr>
-      <w:r>
-        <w:t xml:space="preserve">    // value other code reads with get and sets with set.</w:t>
-      </w:r>
-    </w:p>
-    <w:p>
-      <w:pPr>
-        <w:pStyle w:val="SourceCode"/>
-        <w:keepNext/>
-      </w:pPr>
-      <w:r>
-        <w:t xml:space="preserve">    // It starts empty until it is given a value.</w:t>
+        <w:t xml:space="preserve">    // @code holds the component's C#. A parameter is a value passed in by</w:t>
+      </w:r>
+    </w:p>
+    <w:p>
+      <w:pPr>
+        <w:pStyle w:val="SourceCode"/>
+        <w:keepNext/>
+      </w:pPr>
+      <w:r>
+        <w:t xml:space="preserve">    // the code that renders it; [Parameter] marks it. Razor needs it as a</w:t>
+      </w:r>
+    </w:p>
+    <w:p>
+      <w:pPr>
+        <w:pStyle w:val="SourceCode"/>
+        <w:keepNext/>
+      </w:pPr>
+      <w:r>
+        <w:t xml:space="preserve">    // property: a value other code reads with get and sets with set. It</w:t>
+      </w:r>
+    </w:p>
+    <w:p>
+      <w:pPr>
+        <w:pStyle w:val="SourceCode"/>
+        <w:keepNext/>
+      </w:pPr>
+      <w:r>
+        <w:t xml:space="preserve">    // starts empty until it is given a value.</w:t>
       </w:r>
     </w:p>
     <w:p>
@@ -9950,7 +9950,7 @@
         <w:pStyle w:val="SourceCode"/>
       </w:pPr>
       <w:r>
-        <w:t># The template's name, inside the templates folder beside this program.</w:t>
+        <w:t># The template's name, in app.template_folder, templates, beside this file.</w:t>
       </w:r>
     </w:p>
     <w:p>
@@ -10098,23 +10098,23 @@
         <w:pStyle w:val="SourceCode"/>
       </w:pPr>
       <w:r>
-        <w:t xml:space="preserve">    # the kept copy. Every Jinja2 failure is a TemplateError:</w:t>
-      </w:r>
-    </w:p>
-    <w:p>
-      <w:pPr>
-        <w:pStyle w:val="SourceCode"/>
-      </w:pPr>
-      <w:r>
-        <w:t xml:space="preserve">    # TemplateNotFound for a missing file, whose message is the template's</w:t>
-      </w:r>
-    </w:p>
-    <w:p>
-      <w:pPr>
-        <w:pStyle w:val="SourceCode"/>
-      </w:pPr>
-      <w:r>
-        <w:t xml:space="preserve">    # name, and TemplateSyntaxError for a broken one.</w:t>
+        <w:t xml:space="preserve">    # the kept copy. Every Jinja2 failure is a TemplateError: TemplateNotFound</w:t>
+      </w:r>
+    </w:p>
+    <w:p>
+      <w:pPr>
+        <w:pStyle w:val="SourceCode"/>
+      </w:pPr>
+      <w:r>
+        <w:t xml:space="preserve">    # for a missing file (its message is the name), TemplateSyntaxError for a</w:t>
+      </w:r>
+    </w:p>
+    <w:p>
+      <w:pPr>
+        <w:pStyle w:val="SourceCode"/>
+      </w:pPr>
+      <w:r>
+        <w:t xml:space="preserve">    # broken one. Remember, side-by-side f-strings in brackets join into one.</w:t>
       </w:r>
     </w:p>
     <w:p>
@@ -11259,6 +11259,9 @@
       <w:pPr>
         <w:pStyle w:val="SourceCode"/>
       </w:pPr>
+      <w:r>
+        <w:t>// Remember, import type brings in only a type: Express, the app's type.</w:t>
+      </w:r>
     </w:p>
     <w:p>
       <w:pPr>
@@ -11302,23 +11305,23 @@
         <w:pStyle w:val="SourceCode"/>
       </w:pPr>
       <w:r>
-        <w:t>// Render the page for one name, then call done with the result. With the</w:t>
-      </w:r>
-    </w:p>
-    <w:p>
-      <w:pPr>
-        <w:pStyle w:val="SourceCode"/>
-      </w:pPr>
-      <w:r>
-        <w:t>// view cache on, Express keeps the loaded template, so it can render again</w:t>
-      </w:r>
-    </w:p>
-    <w:p>
-      <w:pPr>
-        <w:pStyle w:val="SourceCode"/>
-      </w:pPr>
-      <w:r>
-        <w:t>// with other data without reading the file.</w:t>
+        <w:t>// Render the page for one name, then call done with the result. done's</w:t>
+      </w:r>
+    </w:p>
+    <w:p>
+      <w:pPr>
+        <w:pStyle w:val="SourceCode"/>
+      </w:pPr>
+      <w:r>
+        <w:t>// type, (error, page) =&gt; void, is a function that takes those two values</w:t>
+      </w:r>
+    </w:p>
+    <w:p>
+      <w:pPr>
+        <w:pStyle w:val="SourceCode"/>
+      </w:pPr>
+      <w:r>
+        <w:t>// and returns nothing; the view cache keeps the template for a re-render.</w:t>
       </w:r>
     </w:p>
     <w:p>
@@ -13037,31 +13040,31 @@
       </w:rPr>
     </w:lvl>
   </w:abstractNum>
-  <w:num w:numId="1" w16cid:durableId="1111439965">
+  <w:num w:numId="1" w16cid:durableId="2109160337">
     <w:abstractNumId w:val="8"/>
   </w:num>
-  <w:num w:numId="2" w16cid:durableId="145636670">
+  <w:num w:numId="2" w16cid:durableId="534927311">
     <w:abstractNumId w:val="6"/>
   </w:num>
-  <w:num w:numId="3" w16cid:durableId="814834804">
+  <w:num w:numId="3" w16cid:durableId="1890333964">
     <w:abstractNumId w:val="5"/>
   </w:num>
-  <w:num w:numId="4" w16cid:durableId="755591338">
+  <w:num w:numId="4" w16cid:durableId="1198852325">
     <w:abstractNumId w:val="4"/>
   </w:num>
-  <w:num w:numId="5" w16cid:durableId="1516797443">
+  <w:num w:numId="5" w16cid:durableId="707531800">
     <w:abstractNumId w:val="7"/>
   </w:num>
-  <w:num w:numId="6" w16cid:durableId="548687572">
+  <w:num w:numId="6" w16cid:durableId="1065106299">
     <w:abstractNumId w:val="3"/>
   </w:num>
-  <w:num w:numId="7" w16cid:durableId="1859655311">
+  <w:num w:numId="7" w16cid:durableId="582838200">
     <w:abstractNumId w:val="2"/>
   </w:num>
-  <w:num w:numId="8" w16cid:durableId="2137750699">
+  <w:num w:numId="8" w16cid:durableId="1186019051">
     <w:abstractNumId w:val="1"/>
   </w:num>
-  <w:num w:numId="9" w16cid:durableId="2133401024">
+  <w:num w:numId="9" w16cid:durableId="1883398666">
     <w:abstractNumId w:val="0"/>
   </w:num>
 </w:numbering>

</xml_diff>